<commit_message>
Practical 12: add GitHub Actions evidence (failed and passed runs)
Co-Authored-By: Claude Opus 5.5 <noreply@anthropic.com>
</commit_message>
<xml_diff>
--- a/practical-12/Practical-12-Submission.docx
+++ b/practical-12/Practical-12-Submission.docx
@@ -2238,7 +2238,7 @@
           <w:sz w:val="23"/>
           <w:szCs w:val="23"/>
         </w:rPr>
-        <w:t xml:space="preserve">12.5 GitHub Actions runs (TO ADD)</w:t>
+        <w:t xml:space="preserve">12.5 GitHub Actions: failed run (red X) after pushing the broken test</w:t>
       </w:r>
     </w:p>
     <w:p>
@@ -2251,7 +2251,367 @@
           <w:sz w:val="22"/>
           <w:szCs w:val="22"/>
         </w:rPr>
-        <w:t xml:space="preserve">After pushing to GitHub, paste screenshots from the Actions tab of one failed run (red X) and one passed run (green check).</w:t>
+        <w:t xml:space="preserve">Run #2 on github.com/Parva-28/AWDF-24CS013: lint passed, build-and-test failed.</w:t>
+      </w:r>
+    </w:p>
+    <w:p>
+      <w:pPr>
+        <w:spacing w:after="160"/>
+      </w:pPr>
+      <w:r>
+        <w:drawing>
+          <wp:inline distT="0" distB="0" distL="0" distR="0">
+            <wp:extent cx="5715000" cy="4019550"/>
+            <wp:effectExtent t="0" r="0" b="0" l="0"/>
+            <wp:docPr id="1" name=""/>
+            <wp:cNvGraphicFramePr>
+              <a:graphicFrameLocks xmlns:a="http://schemas.openxmlformats.org/drawingml/2006/main" noChangeAspect="1"/>
+            </wp:cNvGraphicFramePr>
+            <a:graphic xmlns:a="http://schemas.openxmlformats.org/drawingml/2006/main">
+              <a:graphicData uri="http://schemas.openxmlformats.org/drawingml/2006/picture">
+                <pic:pic xmlns:pic="http://schemas.openxmlformats.org/drawingml/2006/picture">
+                  <pic:nvPicPr>
+                    <pic:cNvPr id="0" name="" descr=""/>
+                    <pic:cNvPicPr>
+                      <a:picLocks noChangeAspect="1" noChangeArrowheads="1"/>
+                    </pic:cNvPicPr>
+                  </pic:nvPicPr>
+                  <pic:blipFill>
+                    <a:blip r:embed="rId9" cstate="none"/>
+                    <a:srcRect/>
+                    <a:stretch>
+                      <a:fillRect/>
+                    </a:stretch>
+                  </pic:blipFill>
+                  <pic:spPr bwMode="auto">
+                    <a:xfrm>
+                      <a:off x="0" y="0"/>
+                      <a:ext cx="5715000" cy="4019550"/>
+                    </a:xfrm>
+                    <a:prstGeom prst="rect">
+                      <a:avLst/>
+                    </a:prstGeom>
+                  </pic:spPr>
+                </pic:pic>
+              </a:graphicData>
+            </a:graphic>
+          </wp:inline>
+        </w:drawing>
+      </w:r>
+    </w:p>
+    <w:p>
+      <w:pPr>
+        <w:spacing w:after="80" w:before="200"/>
+      </w:pPr>
+      <w:r>
+        <w:rPr>
+          <w:rFonts w:ascii="Calibri" w:cs="Calibri" w:eastAsia="Calibri" w:hAnsi="Calibri"/>
+          <w:b/>
+          <w:bCs/>
+          <w:sz w:val="23"/>
+          <w:szCs w:val="23"/>
+        </w:rPr>
+        <w:t xml:space="preserve">12.6 Failure log from the GitHub run</w:t>
+      </w:r>
+    </w:p>
+    <w:p>
+      <w:pPr>
+        <w:shd w:fill="F2F5F9" w:val="clear"/>
+        <w:spacing w:after="0"/>
+      </w:pPr>
+      <w:r>
+        <w:rPr>
+          <w:rFonts w:ascii="Consolas" w:cs="Consolas" w:eastAsia="Consolas" w:hAnsi="Consolas"/>
+          <w:sz w:val="19"/>
+          <w:szCs w:val="19"/>
+        </w:rPr>
+        <w:t xml:space="preserve">GitHub Actions run 39592596513 – job build-and-test, step "Run npm test" (failed lines only)</w:t>
+      </w:r>
+    </w:p>
+    <w:p>
+      <w:pPr>
+        <w:shd w:fill="F2F5F9" w:val="clear"/>
+        <w:spacing w:after="0"/>
+      </w:pPr>
+      <w:r>
+        <w:rPr>
+          <w:rFonts w:ascii="Consolas" w:cs="Consolas" w:eastAsia="Consolas" w:hAnsi="Consolas"/>
+          <w:sz w:val="19"/>
+          <w:szCs w:val="19"/>
+        </w:rPr>
+        <w:t xml:space="preserve"> </w:t>
+      </w:r>
+    </w:p>
+    <w:p>
+      <w:pPr>
+        <w:shd w:fill="F2F5F9" w:val="clear"/>
+        <w:spacing w:after="0"/>
+      </w:pPr>
+      <w:r>
+        <w:rPr>
+          <w:rFonts w:ascii="Consolas" w:cs="Consolas" w:eastAsia="Consolas" w:hAnsi="Consolas"/>
+          <w:sz w:val="19"/>
+          <w:szCs w:val="19"/>
+        </w:rPr>
+        <w:t xml:space="preserve">    not ok 4 - GET /tasks returns 200</w:t>
+      </w:r>
+    </w:p>
+    <w:p>
+      <w:pPr>
+        <w:shd w:fill="F2F5F9" w:val="clear"/>
+        <w:spacing w:after="0"/>
+      </w:pPr>
+      <w:r>
+        <w:rPr>
+          <w:rFonts w:ascii="Consolas" w:cs="Consolas" w:eastAsia="Consolas" w:hAnsi="Consolas"/>
+          <w:sz w:val="19"/>
+          <w:szCs w:val="19"/>
+        </w:rPr>
+        <w:t xml:space="preserve">      expected: 201</w:t>
+      </w:r>
+    </w:p>
+    <w:p>
+      <w:pPr>
+        <w:shd w:fill="F2F5F9" w:val="clear"/>
+        <w:spacing w:after="0"/>
+      </w:pPr>
+      <w:r>
+        <w:rPr>
+          <w:rFonts w:ascii="Consolas" w:cs="Consolas" w:eastAsia="Consolas" w:hAnsi="Consolas"/>
+          <w:sz w:val="19"/>
+          <w:szCs w:val="19"/>
+        </w:rPr>
+        <w:t xml:space="preserve">      actual: 200</w:t>
+      </w:r>
+    </w:p>
+    <w:p>
+      <w:pPr>
+        <w:shd w:fill="F2F5F9" w:val="clear"/>
+        <w:spacing w:after="0"/>
+      </w:pPr>
+      <w:r>
+        <w:rPr>
+          <w:rFonts w:ascii="Consolas" w:cs="Consolas" w:eastAsia="Consolas" w:hAnsi="Consolas"/>
+          <w:sz w:val="19"/>
+          <w:szCs w:val="19"/>
+        </w:rPr>
+        <w:t xml:space="preserve">      operator: 'strictEqual'</w:t>
+      </w:r>
+    </w:p>
+    <w:p>
+      <w:pPr>
+        <w:shd w:fill="F2F5F9" w:val="clear"/>
+        <w:spacing w:after="0"/>
+      </w:pPr>
+      <w:r>
+        <w:rPr>
+          <w:rFonts w:ascii="Consolas" w:cs="Consolas" w:eastAsia="Consolas" w:hAnsi="Consolas"/>
+          <w:sz w:val="19"/>
+          <w:szCs w:val="19"/>
+        </w:rPr>
+        <w:t xml:space="preserve">not ok 1 - Task API</w:t>
+      </w:r>
+    </w:p>
+    <w:p>
+      <w:pPr>
+        <w:shd w:fill="F2F5F9" w:val="clear"/>
+        <w:spacing w:after="0"/>
+      </w:pPr>
+      <w:r>
+        <w:rPr>
+          <w:rFonts w:ascii="Consolas" w:cs="Consolas" w:eastAsia="Consolas" w:hAnsi="Consolas"/>
+          <w:sz w:val="19"/>
+          <w:szCs w:val="19"/>
+        </w:rPr>
+        <w:t xml:space="preserve"># tests 7</w:t>
+      </w:r>
+    </w:p>
+    <w:p>
+      <w:pPr>
+        <w:shd w:fill="F2F5F9" w:val="clear"/>
+        <w:spacing w:after="0"/>
+      </w:pPr>
+      <w:r>
+        <w:rPr>
+          <w:rFonts w:ascii="Consolas" w:cs="Consolas" w:eastAsia="Consolas" w:hAnsi="Consolas"/>
+          <w:sz w:val="19"/>
+          <w:szCs w:val="19"/>
+        </w:rPr>
+        <w:t xml:space="preserve"># pass 6</w:t>
+      </w:r>
+    </w:p>
+    <w:p>
+      <w:pPr>
+        <w:shd w:fill="F2F5F9" w:val="clear"/>
+        <w:spacing w:after="0"/>
+      </w:pPr>
+      <w:r>
+        <w:rPr>
+          <w:rFonts w:ascii="Consolas" w:cs="Consolas" w:eastAsia="Consolas" w:hAnsi="Consolas"/>
+          <w:sz w:val="19"/>
+          <w:szCs w:val="19"/>
+        </w:rPr>
+        <w:t xml:space="preserve"># fail 1</w:t>
+      </w:r>
+    </w:p>
+    <w:p>
+      <w:pPr>
+        <w:shd w:fill="F2F5F9" w:val="clear"/>
+        <w:spacing w:after="0"/>
+      </w:pPr>
+      <w:r>
+        <w:rPr>
+          <w:rFonts w:ascii="Consolas" w:cs="Consolas" w:eastAsia="Consolas" w:hAnsi="Consolas"/>
+          <w:sz w:val="19"/>
+          <w:szCs w:val="19"/>
+        </w:rPr>
+        <w:t xml:space="preserve">##[error]Process completed with exit code 1.</w:t>
+      </w:r>
+    </w:p>
+    <w:p>
+      <w:pPr>
+        <w:spacing w:after="120"/>
+      </w:pPr>
+      <w:r>
+        <w:rPr>
+          <w:rFonts w:ascii="Calibri" w:cs="Calibri" w:eastAsia="Calibri" w:hAnsi="Calibri"/>
+          <w:sz w:val="22"/>
+          <w:szCs w:val="22"/>
+        </w:rPr>
+        <w:t xml:space="preserve"/>
+      </w:r>
+    </w:p>
+    <w:p>
+      <w:pPr>
+        <w:spacing w:after="80" w:before="200"/>
+      </w:pPr>
+      <w:r>
+        <w:rPr>
+          <w:rFonts w:ascii="Calibri" w:cs="Calibri" w:eastAsia="Calibri" w:hAnsi="Calibri"/>
+          <w:b/>
+          <w:bCs/>
+          <w:sz w:val="23"/>
+          <w:szCs w:val="23"/>
+        </w:rPr>
+        <w:t xml:space="preserve">12.7 GitHub Actions: passed run (green check) after fixing the test</w:t>
+      </w:r>
+    </w:p>
+    <w:p>
+      <w:pPr>
+        <w:spacing w:after="120"/>
+      </w:pPr>
+      <w:r>
+        <w:rPr>
+          <w:rFonts w:ascii="Calibri" w:cs="Calibri" w:eastAsia="Calibri" w:hAnsi="Calibri"/>
+          <w:sz w:val="22"/>
+          <w:szCs w:val="22"/>
+        </w:rPr>
+        <w:t xml:space="preserve">Run #3: both jobs succeeded.</w:t>
+      </w:r>
+    </w:p>
+    <w:p>
+      <w:pPr>
+        <w:spacing w:after="160"/>
+      </w:pPr>
+      <w:r>
+        <w:drawing>
+          <wp:inline distT="0" distB="0" distL="0" distR="0">
+            <wp:extent cx="5715000" cy="4019550"/>
+            <wp:effectExtent t="0" r="0" b="0" l="0"/>
+            <wp:docPr id="2" name=""/>
+            <wp:cNvGraphicFramePr>
+              <a:graphicFrameLocks xmlns:a="http://schemas.openxmlformats.org/drawingml/2006/main" noChangeAspect="1"/>
+            </wp:cNvGraphicFramePr>
+            <a:graphic xmlns:a="http://schemas.openxmlformats.org/drawingml/2006/main">
+              <a:graphicData uri="http://schemas.openxmlformats.org/drawingml/2006/picture">
+                <pic:pic xmlns:pic="http://schemas.openxmlformats.org/drawingml/2006/picture">
+                  <pic:nvPicPr>
+                    <pic:cNvPr id="0" name="" descr=""/>
+                    <pic:cNvPicPr>
+                      <a:picLocks noChangeAspect="1" noChangeArrowheads="1"/>
+                    </pic:cNvPicPr>
+                  </pic:nvPicPr>
+                  <pic:blipFill>
+                    <a:blip r:embed="rId10" cstate="none"/>
+                    <a:srcRect/>
+                    <a:stretch>
+                      <a:fillRect/>
+                    </a:stretch>
+                  </pic:blipFill>
+                  <pic:spPr bwMode="auto">
+                    <a:xfrm>
+                      <a:off x="0" y="0"/>
+                      <a:ext cx="5715000" cy="4019550"/>
+                    </a:xfrm>
+                    <a:prstGeom prst="rect">
+                      <a:avLst/>
+                    </a:prstGeom>
+                  </pic:spPr>
+                </pic:pic>
+              </a:graphicData>
+            </a:graphic>
+          </wp:inline>
+        </w:drawing>
+      </w:r>
+    </w:p>
+    <w:p>
+      <w:pPr>
+        <w:spacing w:after="80" w:before="200"/>
+      </w:pPr>
+      <w:r>
+        <w:rPr>
+          <w:rFonts w:ascii="Calibri" w:cs="Calibri" w:eastAsia="Calibri" w:hAnsi="Calibri"/>
+          <w:b/>
+          <w:bCs/>
+          <w:sz w:val="23"/>
+          <w:szCs w:val="23"/>
+        </w:rPr>
+        <w:t xml:space="preserve">12.8 Actions tab: the sequence of runs (pass, fail, pass)</w:t>
+      </w:r>
+    </w:p>
+    <w:p>
+      <w:pPr>
+        <w:spacing w:after="160"/>
+      </w:pPr>
+      <w:r>
+        <w:drawing>
+          <wp:inline distT="0" distB="0" distL="0" distR="0">
+            <wp:extent cx="5715000" cy="4019550"/>
+            <wp:effectExtent t="0" r="0" b="0" l="0"/>
+            <wp:docPr id="3" name=""/>
+            <wp:cNvGraphicFramePr>
+              <a:graphicFrameLocks xmlns:a="http://schemas.openxmlformats.org/drawingml/2006/main" noChangeAspect="1"/>
+            </wp:cNvGraphicFramePr>
+            <a:graphic xmlns:a="http://schemas.openxmlformats.org/drawingml/2006/main">
+              <a:graphicData uri="http://schemas.openxmlformats.org/drawingml/2006/picture">
+                <pic:pic xmlns:pic="http://schemas.openxmlformats.org/drawingml/2006/picture">
+                  <pic:nvPicPr>
+                    <pic:cNvPr id="0" name="" descr=""/>
+                    <pic:cNvPicPr>
+                      <a:picLocks noChangeAspect="1" noChangeArrowheads="1"/>
+                    </pic:cNvPicPr>
+                  </pic:nvPicPr>
+                  <pic:blipFill>
+                    <a:blip r:embed="rId11" cstate="none"/>
+                    <a:srcRect/>
+                    <a:stretch>
+                      <a:fillRect/>
+                    </a:stretch>
+                  </pic:blipFill>
+                  <pic:spPr bwMode="auto">
+                    <a:xfrm>
+                      <a:off x="0" y="0"/>
+                      <a:ext cx="5715000" cy="4019550"/>
+                    </a:xfrm>
+                    <a:prstGeom prst="rect">
+                      <a:avLst/>
+                    </a:prstGeom>
+                  </pic:spPr>
+                </pic:pic>
+              </a:graphicData>
+            </a:graphic>
+          </wp:inline>
+        </w:drawing>
       </w:r>
     </w:p>
     <w:sectPr>

</xml_diff>